<commit_message>
Finished module5 reading notes.
</commit_message>
<xml_diff>
--- a/module5/PERSON_Knaflic_Chs3-4.docx
+++ b/module5/PERSON_Knaflic_Chs3-4.docx
@@ -423,9 +423,6 @@
     </w:p>
     <w:p>
       <w:r>
-        <w:rPr>
-          <w:rFonts w:ascii="inherit" w:hAnsi="inherit"/>
-        </w:rPr>
         <w:t>Record 5 to 7 key quotes or ideas from the chapter:</w:t>
       </w:r>
     </w:p>
@@ -457,6 +454,267 @@
     <w:p>
       <w:r>
         <w:t>Add a 2-5 sentence illustration, example, or reflection in your own words.</w:t>
+      </w:r>
+    </w:p>
+    <w:p/>
+    <w:p>
+      <w:pPr>
+        <w:pStyle w:val="ListParagraph"/>
+        <w:numPr>
+          <w:ilvl w:val="0"/>
+          <w:numId w:val="5"/>
+        </w:numPr>
+      </w:pPr>
+      <w:r>
+        <w:t xml:space="preserve">“Long ago in the evolutionary chain, predators helped our brains develop in ways that allowed for great efficiency of sight and speed of response.” </w:t>
+      </w:r>
+      <w:r>
+        <w:t xml:space="preserve">[Knaflic page 101] </w:t>
+      </w:r>
+      <w:r>
+        <w:t xml:space="preserve">This is critical because this type of response happens without thought and ostensibly with low cognitive load. </w:t>
+      </w:r>
+      <w:r>
+        <w:t xml:space="preserve">Our brains respond </w:t>
+      </w:r>
+      <w:r>
+        <w:t xml:space="preserve">to these cues in under 500 </w:t>
+      </w:r>
+      <w:proofErr w:type="spellStart"/>
+      <w:r>
+        <w:t>ms</w:t>
+      </w:r>
+      <w:proofErr w:type="spellEnd"/>
+      <w:r>
+        <w:t xml:space="preserve"> [1], before the audience even starts reading the text or interpreting the visual their brains are already reacting to the design by directing attention to high contrast areas. </w:t>
+      </w:r>
+      <w:r>
+        <w:t>The thoughtful, sparing use of color, bold text, or similar attributes are examples of leveraging this “</w:t>
+      </w:r>
+      <w:proofErr w:type="spellStart"/>
+      <w:r>
+        <w:t>preattentive</w:t>
+      </w:r>
+      <w:proofErr w:type="spellEnd"/>
+      <w:r>
+        <w:t xml:space="preserve">” mechanism. </w:t>
+      </w:r>
+      <w:r>
+        <w:br/>
+      </w:r>
+      <w:r>
+        <w:br/>
+      </w:r>
+      <w:r>
+        <w:lastRenderedPageBreak/>
+        <w:t xml:space="preserve">True story: this past weekend I was mowing the lawn. I bent over to pick up a stick and my brain accessed iconic memory and thought “SNAKE!”. The reaction was </w:t>
+      </w:r>
+      <w:proofErr w:type="gramStart"/>
+      <w:r>
+        <w:t>primal</w:t>
+      </w:r>
+      <w:proofErr w:type="gramEnd"/>
+      <w:r>
+        <w:t xml:space="preserve"> and I am not normally particularly bothered by snakes. The stick was in fact a stick. I got a good laugh at myself</w:t>
+      </w:r>
+      <w:r>
+        <w:t xml:space="preserve"> and started reflecting on the immediacy of the reaction – it was a pure flight response</w:t>
+      </w:r>
+      <w:r>
+        <w:t xml:space="preserve"> triggered by a </w:t>
+      </w:r>
+      <w:proofErr w:type="spellStart"/>
+      <w:r>
+        <w:t>preattentive</w:t>
+      </w:r>
+      <w:proofErr w:type="spellEnd"/>
+      <w:r>
+        <w:t xml:space="preserve"> icon</w:t>
+      </w:r>
+      <w:r>
+        <w:t>.</w:t>
+      </w:r>
+    </w:p>
+    <w:p>
+      <w:pPr>
+        <w:pStyle w:val="ListParagraph"/>
+        <w:numPr>
+          <w:ilvl w:val="0"/>
+          <w:numId w:val="5"/>
+        </w:numPr>
+      </w:pPr>
+      <w:r>
+        <w:t>“…people can keep about four chunks of visual information in their short-term memory at any given time.” [Knaflic page 101]</w:t>
+      </w:r>
+      <w:r>
+        <w:t xml:space="preserve"> As with my previous example this is under the “A brief lesson on memory” section of Chapter 4. The point here is that visualization developers avoid using an excessive number of colors or icons. Notably, excessive here is a relatively low number of five or more. This is significantly less than one would expect and examples where this is violated are frequent in popular publications. By remaining withing the four or fewer range, our visualizations will be easy to understand by avoiding making the audience work to discern the message.</w:t>
+      </w:r>
+    </w:p>
+    <w:p>
+      <w:pPr>
+        <w:pStyle w:val="ListParagraph"/>
+        <w:numPr>
+          <w:ilvl w:val="0"/>
+          <w:numId w:val="5"/>
+        </w:numPr>
+      </w:pPr>
+      <w:r>
+        <w:t xml:space="preserve">On page 108 Knaflic introduces the concept of a visual hierarchy. Here report developers can leverage </w:t>
+      </w:r>
+      <w:r>
+        <w:t xml:space="preserve">a well-designed set of </w:t>
+      </w:r>
+      <w:proofErr w:type="spellStart"/>
+      <w:r>
+        <w:t>preattentive</w:t>
+      </w:r>
+      <w:proofErr w:type="spellEnd"/>
+      <w:r>
+        <w:t xml:space="preserve"> attributes to </w:t>
+      </w:r>
+      <w:r>
+        <w:t xml:space="preserve">communicate levels of importance. Knaflic uses the example of bright blue to muted blue followed by light grey to indicate the levels implicitly. </w:t>
+      </w:r>
+      <w:r>
+        <w:t xml:space="preserve">This works because </w:t>
+      </w:r>
+      <w:r>
+        <w:t xml:space="preserve">our brains automatically rank the brighter blue higher in emphasis than the muted blue, which in turn is higher than a light grey. Our brains are wired to notice higher contrasting colors like the bright blue first. </w:t>
+      </w:r>
+      <w:r>
+        <w:t>No legend or labeling is needed.</w:t>
+      </w:r>
+    </w:p>
+    <w:p>
+      <w:pPr>
+        <w:pStyle w:val="ListParagraph"/>
+        <w:numPr>
+          <w:ilvl w:val="0"/>
+          <w:numId w:val="5"/>
+        </w:numPr>
+      </w:pPr>
+      <w:r>
+        <w:t xml:space="preserve">Should visualization developers provide variety and </w:t>
+      </w:r>
+      <w:r>
+        <w:t xml:space="preserve">seek to increase audience interest through the </w:t>
+      </w:r>
+      <w:r>
+        <w:t xml:space="preserve">use different colors </w:t>
+      </w:r>
+      <w:r>
+        <w:t xml:space="preserve">between graphs? </w:t>
+      </w:r>
+      <w:proofErr w:type="spellStart"/>
+      <w:r>
+        <w:t>Knaflic’s</w:t>
+      </w:r>
+      <w:proofErr w:type="spellEnd"/>
+      <w:r>
+        <w:t xml:space="preserve"> response is “a resounding no” [Page 120]. There’s no qualification here. Color changes should be purposeful and intentional only. The goal here is communication of a specific message </w:t>
+      </w:r>
+      <w:r>
+        <w:t xml:space="preserve">with minimal cognitive load, </w:t>
+      </w:r>
+      <w:r>
+        <w:t>not visual entertainment</w:t>
+      </w:r>
+      <w:r>
+        <w:t>.</w:t>
+      </w:r>
+    </w:p>
+    <w:p>
+      <w:pPr>
+        <w:pStyle w:val="ListParagraph"/>
+        <w:numPr>
+          <w:ilvl w:val="0"/>
+          <w:numId w:val="5"/>
+        </w:numPr>
+      </w:pPr>
+      <w:r>
+        <w:t xml:space="preserve">Proper positioning of objects on the page can implicitly communicate sequence and importance. On page 124-126 Knaflic describes the natural zigzag “z” pattern that </w:t>
+      </w:r>
+      <w:r>
+        <w:t xml:space="preserve">people intuitively use </w:t>
+      </w:r>
+      <w:r>
+        <w:t>from top left through bottom right of a slide or page.</w:t>
+      </w:r>
+      <w:r>
+        <w:t xml:space="preserve"> Although Knaflic doesn’t say it explicitly, this is undoubtedly because it is the same pattern which we use to read text. Use this (very strong) tendency by putting important items in the upper left of the page. When diagraming data or process </w:t>
+      </w:r>
+      <w:proofErr w:type="spellStart"/>
+      <w:proofErr w:type="gramStart"/>
+      <w:r>
+        <w:t>flows</w:t>
+      </w:r>
+      <w:proofErr w:type="gramEnd"/>
+      <w:r>
+        <w:t xml:space="preserve"> </w:t>
+      </w:r>
+      <w:proofErr w:type="spellEnd"/>
+      <w:r>
+        <w:t xml:space="preserve">we should also start them on the left. </w:t>
+      </w:r>
+      <w:proofErr w:type="gramStart"/>
+      <w:r>
+        <w:t>Similar to</w:t>
+      </w:r>
+      <w:proofErr w:type="gramEnd"/>
+      <w:r>
+        <w:t xml:space="preserve"> </w:t>
+      </w:r>
+      <w:proofErr w:type="spellStart"/>
+      <w:r>
+        <w:t>Knaflic’s</w:t>
+      </w:r>
+      <w:proofErr w:type="spellEnd"/>
+      <w:r>
+        <w:t xml:space="preserve"> example, on my most recent engagement I inherited a large number of data flow diagrams that had the source systems on the right side of the page. </w:t>
+      </w:r>
+      <w:r>
+        <w:t>I repeatedly observed the friction that this layout caused during meetings.</w:t>
+      </w:r>
+    </w:p>
+    <w:p/>
+    <w:p>
+      <w:pPr>
+        <w:pStyle w:val="ListParagraph"/>
+        <w:numPr>
+          <w:ilvl w:val="0"/>
+          <w:numId w:val="7"/>
+        </w:numPr>
+      </w:pPr>
+      <w:r>
+        <w:t xml:space="preserve">Interaction Design Foundation - </w:t>
+      </w:r>
+      <w:proofErr w:type="spellStart"/>
+      <w:r>
+        <w:t>IxDF</w:t>
+      </w:r>
+      <w:proofErr w:type="spellEnd"/>
+      <w:r>
+        <w:t xml:space="preserve">. (2018, October 2). </w:t>
+      </w:r>
+      <w:proofErr w:type="spellStart"/>
+      <w:r>
+        <w:t>Preattentive</w:t>
+      </w:r>
+      <w:proofErr w:type="spellEnd"/>
+      <w:r>
+        <w:t xml:space="preserve"> Visual Properties and How to Use Them in Information Visualization. Interaction Design Foundation - </w:t>
+      </w:r>
+      <w:proofErr w:type="spellStart"/>
+      <w:r>
+        <w:t>IxDF</w:t>
+      </w:r>
+      <w:proofErr w:type="spellEnd"/>
+      <w:r>
+        <w:t>. https://www.interaction-</w:t>
+      </w:r>
+      <w:r>
+        <w:lastRenderedPageBreak/>
+        <w:t>design.org/literature/article/preattentive-visual-properties-and-how-to-use-them-in-information-visualization</w:t>
       </w:r>
     </w:p>
     <w:sectPr>
@@ -537,6 +795,95 @@
 <file path=word/numbering.xml><?xml version="1.0" encoding="utf-8"?>
 <w:numbering xmlns:wpc="http://schemas.microsoft.com/office/word/2010/wordprocessingCanvas" xmlns:cx="http://schemas.microsoft.com/office/drawing/2014/chartex" xmlns:cx1="http://schemas.microsoft.com/office/drawing/2015/9/8/chartex" xmlns:cx2="http://schemas.microsoft.com/office/drawing/2015/10/21/chartex" xmlns:cx3="http://schemas.microsoft.com/office/drawing/2016/5/9/chartex" xmlns:cx4="http://schemas.microsoft.com/office/drawing/2016/5/10/chartex" xmlns:cx5="http://schemas.microsoft.com/office/drawing/2016/5/11/chartex" xmlns:cx6="http://schemas.microsoft.com/office/drawing/2016/5/12/chartex" xmlns:cx7="http://schemas.microsoft.com/office/drawing/2016/5/13/chartex" xmlns:cx8="http://schemas.microsoft.com/office/drawing/2016/5/14/chartex" xmlns:mc="http://schemas.openxmlformats.org/markup-compatibility/2006" xmlns:aink="http://schemas.microsoft.com/office/drawing/2016/ink" xmlns:am3d="http://schemas.microsoft.com/office/drawing/2017/model3d" xmlns:o="urn:schemas-microsoft-com:office:office" xmlns:oel="http://schemas.microsoft.com/office/2019/extlst" xmlns:r="http://schemas.openxmlformats.org/officeDocument/2006/relationships" xmlns:m="http://schemas.openxmlformats.org/officeDocument/2006/math" xmlns:v="urn:schemas-microsoft-com:vml" xmlns:wp14="http://schemas.microsoft.com/office/word/2010/wordprocessingDrawing" xmlns:wp="http://schemas.openxmlformats.org/drawingml/2006/wordprocessingDrawing" xmlns:w10="urn:schemas-microsoft-com:office:word" xmlns:w="http://schemas.openxmlformats.org/wordprocessingml/2006/main" xmlns:w14="http://schemas.microsoft.com/office/word/2010/wordml" xmlns:w15="http://schemas.microsoft.com/office/word/2012/wordml" xmlns:w16cex="http://schemas.microsoft.com/office/word/2018/wordml/cex" xmlns:w16cid="http://schemas.microsoft.com/office/word/2016/wordml/cid" xmlns:w16="http://schemas.microsoft.com/office/word/2018/wordml" xmlns:w16du="http://schemas.microsoft.com/office/word/2023/wordml/word16du" xmlns:w16sdtdh="http://schemas.microsoft.com/office/word/2020/wordml/sdtdatahash" xmlns:w16sdtfl="http://schemas.microsoft.com/office/word/2024/wordml/sdtformatlock" xmlns:w16se="http://schemas.microsoft.com/office/word/2015/wordml/symex" xmlns:wpg="http://schemas.microsoft.com/office/word/2010/wordprocessingGroup" xmlns:wpi="http://schemas.microsoft.com/office/word/2010/wordprocessingInk" xmlns:wne="http://schemas.microsoft.com/office/word/2006/wordml" xmlns:wps="http://schemas.microsoft.com/office/word/2010/wordprocessingShape" mc:Ignorable="w14 w15 w16se w16cid w16 w16cex w16sdtdh w16sdtfl w16du wp14">
   <w:abstractNum w:abstractNumId="0" w15:restartNumberingAfterBreak="0">
+    <w:nsid w:val="1EB83BC2"/>
+    <w:multiLevelType w:val="hybridMultilevel"/>
+    <w:tmpl w:val="C29A2D2C"/>
+    <w:lvl w:ilvl="0" w:tplc="0409000F">
+      <w:start w:val="1"/>
+      <w:numFmt w:val="decimal"/>
+      <w:lvlText w:val="%1."/>
+      <w:lvlJc w:val="left"/>
+      <w:pPr>
+        <w:ind w:left="720" w:hanging="360"/>
+      </w:pPr>
+      <w:rPr>
+        <w:rFonts w:hint="default"/>
+      </w:rPr>
+    </w:lvl>
+    <w:lvl w:ilvl="1" w:tplc="04090019" w:tentative="1">
+      <w:start w:val="1"/>
+      <w:numFmt w:val="lowerLetter"/>
+      <w:lvlText w:val="%2."/>
+      <w:lvlJc w:val="left"/>
+      <w:pPr>
+        <w:ind w:left="1440" w:hanging="360"/>
+      </w:pPr>
+    </w:lvl>
+    <w:lvl w:ilvl="2" w:tplc="0409001B" w:tentative="1">
+      <w:start w:val="1"/>
+      <w:numFmt w:val="lowerRoman"/>
+      <w:lvlText w:val="%3."/>
+      <w:lvlJc w:val="right"/>
+      <w:pPr>
+        <w:ind w:left="2160" w:hanging="180"/>
+      </w:pPr>
+    </w:lvl>
+    <w:lvl w:ilvl="3" w:tplc="0409000F" w:tentative="1">
+      <w:start w:val="1"/>
+      <w:numFmt w:val="decimal"/>
+      <w:lvlText w:val="%4."/>
+      <w:lvlJc w:val="left"/>
+      <w:pPr>
+        <w:ind w:left="2880" w:hanging="360"/>
+      </w:pPr>
+    </w:lvl>
+    <w:lvl w:ilvl="4" w:tplc="04090019" w:tentative="1">
+      <w:start w:val="1"/>
+      <w:numFmt w:val="lowerLetter"/>
+      <w:lvlText w:val="%5."/>
+      <w:lvlJc w:val="left"/>
+      <w:pPr>
+        <w:ind w:left="3600" w:hanging="360"/>
+      </w:pPr>
+    </w:lvl>
+    <w:lvl w:ilvl="5" w:tplc="0409001B" w:tentative="1">
+      <w:start w:val="1"/>
+      <w:numFmt w:val="lowerRoman"/>
+      <w:lvlText w:val="%6."/>
+      <w:lvlJc w:val="right"/>
+      <w:pPr>
+        <w:ind w:left="4320" w:hanging="180"/>
+      </w:pPr>
+    </w:lvl>
+    <w:lvl w:ilvl="6" w:tplc="0409000F" w:tentative="1">
+      <w:start w:val="1"/>
+      <w:numFmt w:val="decimal"/>
+      <w:lvlText w:val="%7."/>
+      <w:lvlJc w:val="left"/>
+      <w:pPr>
+        <w:ind w:left="5040" w:hanging="360"/>
+      </w:pPr>
+    </w:lvl>
+    <w:lvl w:ilvl="7" w:tplc="04090019" w:tentative="1">
+      <w:start w:val="1"/>
+      <w:numFmt w:val="lowerLetter"/>
+      <w:lvlText w:val="%8."/>
+      <w:lvlJc w:val="left"/>
+      <w:pPr>
+        <w:ind w:left="5760" w:hanging="360"/>
+      </w:pPr>
+    </w:lvl>
+    <w:lvl w:ilvl="8" w:tplc="0409001B" w:tentative="1">
+      <w:start w:val="1"/>
+      <w:numFmt w:val="lowerRoman"/>
+      <w:lvlText w:val="%9."/>
+      <w:lvlJc w:val="right"/>
+      <w:pPr>
+        <w:ind w:left="6480" w:hanging="180"/>
+      </w:pPr>
+    </w:lvl>
+  </w:abstractNum>
+  <w:abstractNum w:abstractNumId="1" w15:restartNumberingAfterBreak="0">
     <w:nsid w:val="2C9E66F1"/>
     <w:multiLevelType w:val="multilevel"/>
     <w:tmpl w:val="E0E8A296"/>
@@ -685,7 +1032,7 @@
       </w:rPr>
     </w:lvl>
   </w:abstractNum>
-  <w:abstractNum w:abstractNumId="1" w15:restartNumberingAfterBreak="0">
+  <w:abstractNum w:abstractNumId="2" w15:restartNumberingAfterBreak="0">
     <w:nsid w:val="55915F17"/>
     <w:multiLevelType w:val="multilevel"/>
     <w:tmpl w:val="803CDAC2"/>
@@ -834,7 +1181,7 @@
       </w:rPr>
     </w:lvl>
   </w:abstractNum>
-  <w:abstractNum w:abstractNumId="2" w15:restartNumberingAfterBreak="0">
+  <w:abstractNum w:abstractNumId="3" w15:restartNumberingAfterBreak="0">
     <w:nsid w:val="55FD04B8"/>
     <w:multiLevelType w:val="multilevel"/>
     <w:tmpl w:val="55EA858A"/>
@@ -983,7 +1330,7 @@
       </w:rPr>
     </w:lvl>
   </w:abstractNum>
-  <w:abstractNum w:abstractNumId="3" w15:restartNumberingAfterBreak="0">
+  <w:abstractNum w:abstractNumId="4" w15:restartNumberingAfterBreak="0">
     <w:nsid w:val="657D2CBC"/>
     <w:multiLevelType w:val="hybridMultilevel"/>
     <w:tmpl w:val="AA202CB6"/>
@@ -993,7 +1340,7 @@
       <w:lvlText w:val=""/>
       <w:lvlJc w:val="left"/>
       <w:pPr>
-        <w:ind w:left="1440" w:hanging="360"/>
+        <w:ind w:left="1080" w:hanging="360"/>
       </w:pPr>
       <w:rPr>
         <w:rFonts w:ascii="Symbol" w:hAnsi="Symbol" w:hint="default"/>
@@ -1005,7 +1352,7 @@
       <w:lvlText w:val="o"/>
       <w:lvlJc w:val="left"/>
       <w:pPr>
-        <w:ind w:left="2160" w:hanging="360"/>
+        <w:ind w:left="1800" w:hanging="360"/>
       </w:pPr>
       <w:rPr>
         <w:rFonts w:ascii="Courier New" w:hAnsi="Courier New" w:cs="Courier New" w:hint="default"/>
@@ -1017,7 +1364,7 @@
       <w:lvlText w:val=""/>
       <w:lvlJc w:val="left"/>
       <w:pPr>
-        <w:ind w:left="2880" w:hanging="360"/>
+        <w:ind w:left="2520" w:hanging="360"/>
       </w:pPr>
       <w:rPr>
         <w:rFonts w:ascii="Wingdings" w:hAnsi="Wingdings" w:hint="default"/>
@@ -1029,7 +1376,7 @@
       <w:lvlText w:val=""/>
       <w:lvlJc w:val="left"/>
       <w:pPr>
-        <w:ind w:left="3600" w:hanging="360"/>
+        <w:ind w:left="3240" w:hanging="360"/>
       </w:pPr>
       <w:rPr>
         <w:rFonts w:ascii="Symbol" w:hAnsi="Symbol" w:hint="default"/>
@@ -1041,7 +1388,7 @@
       <w:lvlText w:val="o"/>
       <w:lvlJc w:val="left"/>
       <w:pPr>
-        <w:ind w:left="4320" w:hanging="360"/>
+        <w:ind w:left="3960" w:hanging="360"/>
       </w:pPr>
       <w:rPr>
         <w:rFonts w:ascii="Courier New" w:hAnsi="Courier New" w:cs="Courier New" w:hint="default"/>
@@ -1053,7 +1400,7 @@
       <w:lvlText w:val=""/>
       <w:lvlJc w:val="left"/>
       <w:pPr>
-        <w:ind w:left="5040" w:hanging="360"/>
+        <w:ind w:left="4680" w:hanging="360"/>
       </w:pPr>
       <w:rPr>
         <w:rFonts w:ascii="Wingdings" w:hAnsi="Wingdings" w:hint="default"/>
@@ -1065,7 +1412,7 @@
       <w:lvlText w:val=""/>
       <w:lvlJc w:val="left"/>
       <w:pPr>
-        <w:ind w:left="5760" w:hanging="360"/>
+        <w:ind w:left="5400" w:hanging="360"/>
       </w:pPr>
       <w:rPr>
         <w:rFonts w:ascii="Symbol" w:hAnsi="Symbol" w:hint="default"/>
@@ -1077,7 +1424,7 @@
       <w:lvlText w:val="o"/>
       <w:lvlJc w:val="left"/>
       <w:pPr>
-        <w:ind w:left="6480" w:hanging="360"/>
+        <w:ind w:left="6120" w:hanging="360"/>
       </w:pPr>
       <w:rPr>
         <w:rFonts w:ascii="Courier New" w:hAnsi="Courier New" w:cs="Courier New" w:hint="default"/>
@@ -1089,14 +1436,14 @@
       <w:lvlText w:val=""/>
       <w:lvlJc w:val="left"/>
       <w:pPr>
-        <w:ind w:left="7200" w:hanging="360"/>
+        <w:ind w:left="6840" w:hanging="360"/>
       </w:pPr>
       <w:rPr>
         <w:rFonts w:ascii="Wingdings" w:hAnsi="Wingdings" w:hint="default"/>
       </w:rPr>
     </w:lvl>
   </w:abstractNum>
-  <w:abstractNum w:abstractNumId="4" w15:restartNumberingAfterBreak="0">
+  <w:abstractNum w:abstractNumId="5" w15:restartNumberingAfterBreak="0">
     <w:nsid w:val="6B026D79"/>
     <w:multiLevelType w:val="multilevel"/>
     <w:tmpl w:val="205A8584"/>
@@ -1245,7 +1592,7 @@
       </w:rPr>
     </w:lvl>
   </w:abstractNum>
-  <w:abstractNum w:abstractNumId="5" w15:restartNumberingAfterBreak="0">
+  <w:abstractNum w:abstractNumId="6" w15:restartNumberingAfterBreak="0">
     <w:nsid w:val="77D04083"/>
     <w:multiLevelType w:val="hybridMultilevel"/>
     <w:tmpl w:val="D8A60AA0"/>
@@ -1335,22 +1682,25 @@
     </w:lvl>
   </w:abstractNum>
   <w:num w:numId="1" w16cid:durableId="1838113127">
-    <w:abstractNumId w:val="0"/>
+    <w:abstractNumId w:val="1"/>
   </w:num>
   <w:num w:numId="2" w16cid:durableId="1419867669">
+    <w:abstractNumId w:val="5"/>
+  </w:num>
+  <w:num w:numId="3" w16cid:durableId="1300458278">
+    <w:abstractNumId w:val="3"/>
+  </w:num>
+  <w:num w:numId="4" w16cid:durableId="43531920">
+    <w:abstractNumId w:val="2"/>
+  </w:num>
+  <w:num w:numId="5" w16cid:durableId="1550994873">
     <w:abstractNumId w:val="4"/>
   </w:num>
-  <w:num w:numId="3" w16cid:durableId="1300458278">
-    <w:abstractNumId w:val="2"/>
+  <w:num w:numId="6" w16cid:durableId="925572200">
+    <w:abstractNumId w:val="6"/>
   </w:num>
-  <w:num w:numId="4" w16cid:durableId="43531920">
-    <w:abstractNumId w:val="1"/>
-  </w:num>
-  <w:num w:numId="5" w16cid:durableId="1550994873">
-    <w:abstractNumId w:val="3"/>
-  </w:num>
-  <w:num w:numId="6" w16cid:durableId="925572200">
-    <w:abstractNumId w:val="5"/>
+  <w:num w:numId="7" w16cid:durableId="1821996989">
+    <w:abstractNumId w:val="0"/>
   </w:num>
 </w:numbering>
 </file>

</xml_diff>